<commit_message>
docs: update project documentation with user revisions
</commit_message>
<xml_diff>
--- a/docs/FactoryGPT_Project_Documentation.docx
+++ b/docs/FactoryGPT_Project_Documentation.docx
@@ -366,11 +366,6 @@
       <w:pPr>
         <w:pStyle w:val="3"/>
       </w:pPr>
-      <w:r>
-        <w:rPr>
-          <w:rFonts w:ascii="Calibri" w:hAnsi="Calibri"/>
-        </w:rPr>
-      </w:r>
       <w:r>
         <w:rPr>
           <w:rFonts w:ascii="Calibri" w:hAnsi="Calibri"/>
@@ -1482,8 +1477,6 @@
         </w:rPr>
         <w:br w:type="page"/>
       </w:r>
-      <w:bookmarkStart w:id="0" w:name="_GoBack"/>
-      <w:bookmarkEnd w:id="0"/>
     </w:p>
     <w:p>
       <w:pPr>
@@ -11534,11 +11527,6 @@
       <w:r>
         <w:rPr>
           <w:rFonts w:ascii="Calibri" w:hAnsi="Calibri"/>
-        </w:rPr>
-      </w:r>
-      <w:r>
-        <w:rPr>
-          <w:rFonts w:ascii="Calibri" w:hAnsi="Calibri"/>
           <w:b/>
           <w:sz w:val="22"/>
         </w:rPr>
@@ -11560,11 +11548,6 @@
       <w:r>
         <w:rPr>
           <w:rFonts w:ascii="Calibri" w:hAnsi="Calibri"/>
-        </w:rPr>
-      </w:r>
-      <w:r>
-        <w:rPr>
-          <w:rFonts w:ascii="Calibri" w:hAnsi="Calibri"/>
           <w:b/>
           <w:sz w:val="22"/>
         </w:rPr>
@@ -11652,11 +11635,6 @@
       <w:r>
         <w:rPr>
           <w:rFonts w:ascii="Calibri" w:hAnsi="Calibri"/>
-        </w:rPr>
-      </w:r>
-      <w:r>
-        <w:rPr>
-          <w:rFonts w:ascii="Calibri" w:hAnsi="Calibri"/>
           <w:b/>
           <w:sz w:val="28"/>
         </w:rPr>
@@ -11671,11 +11649,6 @@
       <w:r>
         <w:rPr>
           <w:rFonts w:ascii="Calibri" w:hAnsi="Calibri"/>
-        </w:rPr>
-      </w:r>
-      <w:r>
-        <w:rPr>
-          <w:rFonts w:ascii="Calibri" w:hAnsi="Calibri"/>
           <w:b/>
           <w:sz w:val="24"/>
         </w:rPr>
@@ -11700,11 +11673,6 @@
       <w:r>
         <w:rPr>
           <w:rFonts w:ascii="Calibri" w:hAnsi="Calibri"/>
-        </w:rPr>
-      </w:r>
-      <w:r>
-        <w:rPr>
-          <w:rFonts w:ascii="Calibri" w:hAnsi="Calibri"/>
           <w:b/>
           <w:sz w:val="24"/>
         </w:rPr>
@@ -11718,11 +11686,6 @@
       <w:r>
         <w:rPr>
           <w:rFonts w:ascii="Calibri" w:hAnsi="Calibri"/>
-        </w:rPr>
-      </w:r>
-      <w:r>
-        <w:rPr>
-          <w:rFonts w:ascii="Calibri" w:hAnsi="Calibri"/>
           <w:b/>
           <w:sz w:val="22"/>
         </w:rPr>
@@ -11743,11 +11706,6 @@
       <w:r>
         <w:rPr>
           <w:rFonts w:ascii="Calibri" w:hAnsi="Calibri"/>
-        </w:rPr>
-      </w:r>
-      <w:r>
-        <w:rPr>
-          <w:rFonts w:ascii="Calibri" w:hAnsi="Calibri"/>
           <w:b/>
           <w:sz w:val="22"/>
         </w:rPr>
@@ -11768,11 +11726,6 @@
       <w:r>
         <w:rPr>
           <w:rFonts w:ascii="Calibri" w:hAnsi="Calibri"/>
-        </w:rPr>
-      </w:r>
-      <w:r>
-        <w:rPr>
-          <w:rFonts w:ascii="Calibri" w:hAnsi="Calibri"/>
           <w:b/>
           <w:sz w:val="22"/>
         </w:rPr>
@@ -11793,11 +11746,6 @@
       <w:r>
         <w:rPr>
           <w:rFonts w:ascii="Calibri" w:hAnsi="Calibri"/>
-        </w:rPr>
-      </w:r>
-      <w:r>
-        <w:rPr>
-          <w:rFonts w:ascii="Calibri" w:hAnsi="Calibri"/>
           <w:b/>
           <w:sz w:val="22"/>
         </w:rPr>
@@ -11818,11 +11766,6 @@
       <w:r>
         <w:rPr>
           <w:rFonts w:ascii="Calibri" w:hAnsi="Calibri"/>
-        </w:rPr>
-      </w:r>
-      <w:r>
-        <w:rPr>
-          <w:rFonts w:ascii="Calibri" w:hAnsi="Calibri"/>
           <w:b/>
           <w:sz w:val="22"/>
         </w:rPr>
@@ -11840,11 +11783,6 @@
       <w:pPr>
         <w:pStyle w:val="23"/>
       </w:pPr>
-      <w:r>
-        <w:rPr>
-          <w:rFonts w:ascii="Calibri" w:hAnsi="Calibri"/>
-        </w:rPr>
-      </w:r>
       <w:r>
         <w:rPr>
           <w:rFonts w:ascii="Calibri" w:hAnsi="Calibri"/>
@@ -11869,11 +11807,6 @@
       <w:r>
         <w:rPr>
           <w:rFonts w:ascii="Calibri" w:hAnsi="Calibri"/>
-        </w:rPr>
-      </w:r>
-      <w:r>
-        <w:rPr>
-          <w:rFonts w:ascii="Calibri" w:hAnsi="Calibri"/>
           <w:b/>
           <w:sz w:val="24"/>
         </w:rPr>
@@ -11897,11 +11830,6 @@
       <w:r>
         <w:rPr>
           <w:rFonts w:ascii="Calibri" w:hAnsi="Calibri"/>
-        </w:rPr>
-      </w:r>
-      <w:r>
-        <w:rPr>
-          <w:rFonts w:ascii="Calibri" w:hAnsi="Calibri"/>
           <w:b/>
           <w:sz w:val="22"/>
         </w:rPr>
@@ -11919,11 +11847,6 @@
       <w:pPr>
         <w:pStyle w:val="23"/>
       </w:pPr>
-      <w:r>
-        <w:rPr>
-          <w:rFonts w:ascii="Calibri" w:hAnsi="Calibri"/>
-        </w:rPr>
-      </w:r>
       <w:r>
         <w:rPr>
           <w:rFonts w:ascii="Calibri" w:hAnsi="Calibri"/>
@@ -11948,11 +11871,6 @@
       <w:r>
         <w:rPr>
           <w:rFonts w:ascii="Calibri" w:hAnsi="Calibri"/>
-        </w:rPr>
-      </w:r>
-      <w:r>
-        <w:rPr>
-          <w:rFonts w:ascii="Calibri" w:hAnsi="Calibri"/>
           <w:b/>
           <w:sz w:val="24"/>
         </w:rPr>
@@ -11987,11 +11905,6 @@
       <w:r>
         <w:rPr>
           <w:rFonts w:ascii="Calibri" w:hAnsi="Calibri"/>
-        </w:rPr>
-      </w:r>
-      <w:r>
-        <w:rPr>
-          <w:rFonts w:ascii="Calibri" w:hAnsi="Calibri"/>
           <w:b/>
           <w:sz w:val="24"/>
         </w:rPr>
@@ -12005,11 +11918,6 @@
       <w:r>
         <w:rPr>
           <w:rFonts w:ascii="Calibri" w:hAnsi="Calibri"/>
-        </w:rPr>
-      </w:r>
-      <w:r>
-        <w:rPr>
-          <w:rFonts w:ascii="Calibri" w:hAnsi="Calibri"/>
           <w:b/>
           <w:sz w:val="22"/>
         </w:rPr>
@@ -12030,11 +11938,6 @@
       <w:r>
         <w:rPr>
           <w:rFonts w:ascii="Calibri" w:hAnsi="Calibri"/>
-        </w:rPr>
-      </w:r>
-      <w:r>
-        <w:rPr>
-          <w:rFonts w:ascii="Calibri" w:hAnsi="Calibri"/>
           <w:b/>
           <w:sz w:val="22"/>
         </w:rPr>
@@ -12055,11 +11958,6 @@
       <w:r>
         <w:rPr>
           <w:rFonts w:ascii="Calibri" w:hAnsi="Calibri"/>
-        </w:rPr>
-      </w:r>
-      <w:r>
-        <w:rPr>
-          <w:rFonts w:ascii="Calibri" w:hAnsi="Calibri"/>
           <w:b/>
           <w:sz w:val="22"/>
         </w:rPr>
@@ -12080,11 +11978,6 @@
       <w:r>
         <w:rPr>
           <w:rFonts w:ascii="Calibri" w:hAnsi="Calibri"/>
-        </w:rPr>
-      </w:r>
-      <w:r>
-        <w:rPr>
-          <w:rFonts w:ascii="Calibri" w:hAnsi="Calibri"/>
           <w:b/>
           <w:sz w:val="22"/>
         </w:rPr>
@@ -12102,11 +11995,6 @@
       <w:pPr>
         <w:pStyle w:val="23"/>
       </w:pPr>
-      <w:r>
-        <w:rPr>
-          <w:rFonts w:ascii="Calibri" w:hAnsi="Calibri"/>
-        </w:rPr>
-      </w:r>
       <w:r>
         <w:rPr>
           <w:rFonts w:ascii="Calibri" w:hAnsi="Calibri"/>
@@ -12131,11 +12019,6 @@
       <w:r>
         <w:rPr>
           <w:rFonts w:ascii="Calibri" w:hAnsi="Calibri"/>
-        </w:rPr>
-      </w:r>
-      <w:r>
-        <w:rPr>
-          <w:rFonts w:ascii="Calibri" w:hAnsi="Calibri"/>
           <w:b/>
           <w:sz w:val="24"/>
         </w:rPr>
@@ -12160,11 +12043,6 @@
       <w:r>
         <w:rPr>
           <w:rFonts w:ascii="Calibri" w:hAnsi="Calibri"/>
-        </w:rPr>
-      </w:r>
-      <w:r>
-        <w:rPr>
-          <w:rFonts w:ascii="Calibri" w:hAnsi="Calibri"/>
           <w:b/>
           <w:sz w:val="24"/>
         </w:rPr>
@@ -12175,11 +12053,6 @@
       <w:pPr>
         <w:pStyle w:val="23"/>
       </w:pPr>
-      <w:r>
-        <w:rPr>
-          <w:rFonts w:ascii="Calibri" w:hAnsi="Calibri"/>
-        </w:rPr>
-      </w:r>
       <w:r>
         <w:rPr>
           <w:rFonts w:ascii="Calibri" w:hAnsi="Calibri"/>
@@ -23594,55 +23467,8 @@
           <w:lang w:val="en-US"/>
         </w:rPr>
       </w:pPr>
-      <w:r>
-        <w:rPr>
-          <w:rFonts w:hint="default" w:ascii="Calibri" w:hAnsi="Calibri"/>
-          <w:color w:val="0D47A1"/>
-          <w:sz w:val="20"/>
-          <w:lang w:val="en-US"/>
-        </w:rPr>
-        <w:t>Factory owner</w:t>
-      </w:r>
-    </w:p>
-    <w:p>
-      <w:pPr>
-        <w:jc w:val="center"/>
-        <w:rPr>
-          <w:rFonts w:hint="default"/>
-          <w:color w:val="0D47A1"/>
-          <w:sz w:val="20"/>
-          <w:lang w:val="en-US"/>
-        </w:rPr>
-      </w:pPr>
-      <w:r>
-        <w:rPr>
-          <w:rFonts w:hint="default" w:ascii="Calibri" w:hAnsi="Calibri"/>
-          <w:color w:val="0D47A1"/>
-          <w:sz w:val="20"/>
-          <w:lang w:val="en-US"/>
-        </w:rPr>
-        <w:t>Manager</w:t>
-      </w:r>
-    </w:p>
-    <w:p>
-      <w:pPr>
-        <w:jc w:val="center"/>
-        <w:rPr>
-          <w:rFonts w:hint="default"/>
-          <w:color w:val="0D47A1"/>
-          <w:sz w:val="20"/>
-          <w:lang w:val="en-US"/>
-        </w:rPr>
-      </w:pPr>
-      <w:r>
-        <w:rPr>
-          <w:rFonts w:hint="default" w:ascii="Calibri" w:hAnsi="Calibri"/>
-          <w:color w:val="0D47A1"/>
-          <w:sz w:val="20"/>
-          <w:lang w:val="en-US"/>
-        </w:rPr>
-        <w:t>Employees</w:t>
-      </w:r>
+      <w:bookmarkStart w:id="0" w:name="_GoBack"/>
+      <w:bookmarkEnd w:id="0"/>
     </w:p>
     <w:p>
       <w:pPr>
@@ -24047,7 +23873,7 @@
     <w:lsdException w:qFormat="1" w:unhideWhenUsed="0" w:uiPriority="70" w:semiHidden="0" w:name="Dark List Accent 1"/>
     <w:lsdException w:qFormat="1" w:unhideWhenUsed="0" w:uiPriority="71" w:semiHidden="0" w:name="Colorful Shading Accent 1"/>
     <w:lsdException w:qFormat="1" w:unhideWhenUsed="0" w:uiPriority="72" w:semiHidden="0" w:name="Colorful List Accent 1"/>
-    <w:lsdException w:unhideWhenUsed="0" w:uiPriority="73" w:semiHidden="0" w:name="Colorful Grid Accent 1"/>
+    <w:lsdException w:qFormat="1" w:unhideWhenUsed="0" w:uiPriority="73" w:semiHidden="0" w:name="Colorful Grid Accent 1"/>
     <w:lsdException w:qFormat="1" w:unhideWhenUsed="0" w:uiPriority="60" w:semiHidden="0" w:name="Light Shading Accent 2"/>
     <w:lsdException w:qFormat="1" w:unhideWhenUsed="0" w:uiPriority="61" w:semiHidden="0" w:name="Light List Accent 2"/>
     <w:lsdException w:qFormat="1" w:unhideWhenUsed="0" w:uiPriority="62" w:semiHidden="0" w:name="Light Grid Accent 2"/>
@@ -35661,6 +35487,7 @@
   <w:style w:type="table" w:styleId="129">
     <w:name w:val="Colorful Grid Accent 1"/>
     <w:basedOn w:val="12"/>
+    <w:qFormat/>
     <w:uiPriority w:val="73"/>
     <w:pPr>
       <w:spacing w:after="0" w:line="240" w:lineRule="auto"/>
@@ -36286,6 +36113,7 @@
     <w:name w:val="Heading 2 Char"/>
     <w:basedOn w:val="11"/>
     <w:link w:val="3"/>
+    <w:qFormat/>
     <w:uiPriority w:val="9"/>
     <w:rPr>
       <w:rFonts w:asciiTheme="majorHAnsi" w:hAnsiTheme="majorHAnsi" w:eastAsiaTheme="majorEastAsia" w:cstheme="majorBidi"/>

</xml_diff>